<commit_message>
Updated formattting on UAT
</commit_message>
<xml_diff>
--- a/Design Documents/Final Submission Contributions/UAT Test Plan Final.docx
+++ b/Design Documents/Final Submission Contributions/UAT Test Plan Final.docx
@@ -40,25 +40,45 @@
           <w:sz w:val="140"/>
           <w:szCs w:val="140"/>
         </w:rPr>
-        <w:t>for</w:t>
+        <w:t>F</w:t>
+      </w:r>
+      <w:r>
+        <w:rPr>
+          <w:sz w:val="140"/>
+          <w:szCs w:val="140"/>
+        </w:rPr>
+        <w:t>or</w:t>
+      </w:r>
+      <w:r>
+        <w:rPr>
+          <w:sz w:val="140"/>
+          <w:szCs w:val="140"/>
+        </w:rPr>
+        <w:t xml:space="preserve"> Group 29</w:t>
       </w:r>
     </w:p>
     <w:p>
       <w:pPr>
         <w:jc w:val="center"/>
         <w:rPr>
+          <w:lang w:val="en-US"/>
+        </w:rPr>
+      </w:pPr>
+      <w:r>
+        <w:rPr>
           <w:sz w:val="140"/>
           <w:szCs w:val="140"/>
           <w:lang w:val="en-US"/>
         </w:rPr>
-      </w:pPr>
+        <w:t>[</w:t>
+      </w:r>
       <w:r>
         <w:rPr>
           <w:sz w:val="140"/>
           <w:szCs w:val="140"/>
           <w:lang w:val="en-US"/>
         </w:rPr>
-        <w:t>[</w:t>
+        <w:t>Rules Card</w:t>
       </w:r>
       <w:r>
         <w:rPr>
@@ -66,22 +86,24 @@
           <w:szCs w:val="140"/>
           <w:lang w:val="en-US"/>
         </w:rPr>
-        <w:t>Rules Card</w:t>
+        <w:t>]</w:t>
       </w:r>
       <w:r>
+        <w:rPr>
+          <w:lang w:val="en-US"/>
+        </w:rPr>
+        <w:br w:type="page"/>
+      </w:r>
+    </w:p>
+    <w:p>
+      <w:pPr>
+        <w:jc w:val="center"/>
         <w:rPr>
           <w:sz w:val="140"/>
           <w:szCs w:val="140"/>
           <w:lang w:val="en-US"/>
         </w:rPr>
-        <w:t>]</w:t>
-      </w:r>
-      <w:r>
-        <w:rPr>
-          <w:lang w:val="en-US"/>
-        </w:rPr>
-        <w:br w:type="page"/>
-      </w:r>
+      </w:pPr>
     </w:p>
     <w:p>
       <w:pPr>
@@ -101,7 +123,6 @@
           <w:szCs w:val="28"/>
           <w:lang w:val="en-US"/>
         </w:rPr>
-        <w:lastRenderedPageBreak/>
         <w:t>Document purpose:</w:t>
       </w:r>
       <w:r>
@@ -627,6 +648,7 @@
         <w:rPr>
           <w:lang w:val="en-US"/>
         </w:rPr>
+        <w:lastRenderedPageBreak/>
         <w:t xml:space="preserve">Enjoyment and engagement </w:t>
       </w:r>
     </w:p>
@@ -716,7 +738,6 @@
           <w:sz w:val="36"/>
           <w:szCs w:val="36"/>
         </w:rPr>
-        <w:lastRenderedPageBreak/>
         <w:t>3. Environmental Requirements</w:t>
       </w:r>
       <w:r>
@@ -1221,6 +1242,7 @@
           <w:szCs w:val="24"/>
           <w:lang w:val="en-US"/>
         </w:rPr>
+        <w:lastRenderedPageBreak/>
         <w:t>As this project is a lightweight card game, runtime requirements are lower than development requirements. Therefore:</w:t>
       </w:r>
     </w:p>
@@ -1286,7 +1308,6 @@
           <w:sz w:val="24"/>
           <w:szCs w:val="24"/>
         </w:rPr>
-        <w:lastRenderedPageBreak/>
         <w:t>4. Network Requirements</w:t>
       </w:r>
     </w:p>
@@ -1971,6 +1992,7 @@
           <w:szCs w:val="24"/>
           <w:lang w:val="en-US"/>
         </w:rPr>
+        <w:lastRenderedPageBreak/>
         <w:t>AI responses validated locally before use</w:t>
       </w:r>
     </w:p>
@@ -2080,7 +2102,6 @@
           <w:sz w:val="24"/>
           <w:szCs w:val="24"/>
         </w:rPr>
-        <w:lastRenderedPageBreak/>
         <w:t>Scales across mobile devices (if deployed)</w:t>
       </w:r>
     </w:p>
@@ -3471,6 +3492,7 @@
                 <w:szCs w:val="28"/>
                 <w:lang w:val="en-US"/>
               </w:rPr>
+              <w:lastRenderedPageBreak/>
               <w:t>Tester: New User</w:t>
             </w:r>
           </w:p>
@@ -3628,7 +3650,6 @@
                 <w:szCs w:val="28"/>
                 <w:lang w:val="en-US"/>
               </w:rPr>
-              <w:lastRenderedPageBreak/>
               <w:t>Recorder</w:t>
             </w:r>
           </w:p>
@@ -5243,6 +5264,7 @@
                 <w:szCs w:val="28"/>
                 <w:lang w:val="en-US"/>
               </w:rPr>
+              <w:lastRenderedPageBreak/>
               <w:t>3</w:t>
             </w:r>
           </w:p>
@@ -5457,7 +5479,6 @@
                 <w:szCs w:val="28"/>
                 <w:lang w:val="en-US"/>
               </w:rPr>
-              <w:lastRenderedPageBreak/>
               <w:t>5</w:t>
             </w:r>
           </w:p>
@@ -6286,12 +6307,12 @@
         <w:tblLook w:val="0000" w:firstRow="0" w:lastRow="0" w:firstColumn="0" w:lastColumn="0" w:noHBand="0" w:noVBand="0"/>
       </w:tblPr>
       <w:tblGrid>
-        <w:gridCol w:w="743"/>
-        <w:gridCol w:w="1775"/>
-        <w:gridCol w:w="2126"/>
-        <w:gridCol w:w="2614"/>
-        <w:gridCol w:w="890"/>
-        <w:gridCol w:w="878"/>
+        <w:gridCol w:w="791"/>
+        <w:gridCol w:w="1867"/>
+        <w:gridCol w:w="2241"/>
+        <w:gridCol w:w="2755"/>
+        <w:gridCol w:w="690"/>
+        <w:gridCol w:w="682"/>
       </w:tblGrid>
       <w:tr>
         <w:trPr>
@@ -6451,19 +6472,37 @@
             <w:pPr>
               <w:rPr>
                 <w:rFonts w:ascii="Calibri" w:eastAsia="Calibri" w:hAnsi="Calibri" w:cs="Calibri"/>
-                <w:sz w:val="28"/>
-                <w:szCs w:val="28"/>
-                <w:lang w:val="en-GB"/>
-              </w:rPr>
-            </w:pPr>
-            <w:r>
-              <w:rPr>
-                <w:rFonts w:ascii="Calibri" w:eastAsia="Calibri" w:hAnsi="Calibri" w:cs="Calibri"/>
-                <w:sz w:val="28"/>
-                <w:szCs w:val="28"/>
-                <w:lang w:val="en-US"/>
-              </w:rPr>
-              <w:t>Actual Result</w:t>
+                <w:sz w:val="18"/>
+                <w:szCs w:val="18"/>
+                <w:lang w:val="en-GB"/>
+              </w:rPr>
+            </w:pPr>
+            <w:r>
+              <w:rPr>
+                <w:rFonts w:ascii="Calibri" w:eastAsia="Calibri" w:hAnsi="Calibri" w:cs="Calibri"/>
+                <w:sz w:val="18"/>
+                <w:szCs w:val="18"/>
+                <w:lang w:val="en-US"/>
+              </w:rPr>
+              <w:t>Actua</w:t>
+            </w:r>
+            <w:r>
+              <w:rPr>
+                <w:rFonts w:ascii="Calibri" w:eastAsia="Calibri" w:hAnsi="Calibri" w:cs="Calibri"/>
+                <w:sz w:val="18"/>
+                <w:szCs w:val="18"/>
+                <w:lang w:val="en-US"/>
+              </w:rPr>
+              <w:t>l</w:t>
+            </w:r>
+            <w:r>
+              <w:rPr>
+                <w:rFonts w:ascii="Calibri" w:eastAsia="Calibri" w:hAnsi="Calibri" w:cs="Calibri"/>
+                <w:sz w:val="18"/>
+                <w:szCs w:val="18"/>
+                <w:lang w:val="en-US"/>
+              </w:rPr>
+              <w:t xml:space="preserve"> Result</w:t>
             </w:r>
           </w:p>
         </w:tc>
@@ -6485,16 +6524,16 @@
             <w:pPr>
               <w:rPr>
                 <w:rFonts w:ascii="Calibri" w:eastAsia="Calibri" w:hAnsi="Calibri" w:cs="Calibri"/>
-                <w:sz w:val="28"/>
-                <w:szCs w:val="28"/>
-                <w:lang w:val="en-GB"/>
-              </w:rPr>
-            </w:pPr>
-            <w:r>
-              <w:rPr>
-                <w:rFonts w:ascii="Calibri" w:eastAsia="Calibri" w:hAnsi="Calibri" w:cs="Calibri"/>
-                <w:sz w:val="28"/>
-                <w:szCs w:val="28"/>
+                <w:sz w:val="18"/>
+                <w:szCs w:val="18"/>
+                <w:lang w:val="en-GB"/>
+              </w:rPr>
+            </w:pPr>
+            <w:r>
+              <w:rPr>
+                <w:rFonts w:ascii="Calibri" w:eastAsia="Calibri" w:hAnsi="Calibri" w:cs="Calibri"/>
+                <w:sz w:val="18"/>
+                <w:szCs w:val="18"/>
                 <w:lang w:val="en-US"/>
               </w:rPr>
               <w:t>Status</w:t>
@@ -7161,7 +7200,7 @@
                 <w:szCs w:val="28"/>
                 <w:lang w:val="en-US"/>
               </w:rPr>
-              <w:t xml:space="preserve">Without explanation, </w:t>
+              <w:t xml:space="preserve">Without explanation, identify player </w:t>
             </w:r>
             <w:r>
               <w:rPr>
@@ -7171,7 +7210,7 @@
                 <w:lang w:val="en-US"/>
               </w:rPr>
               <w:lastRenderedPageBreak/>
-              <w:t>identify player hand, AI area, discard/stack area, score and end turn controls.</w:t>
+              <w:t>hand, AI area, discard/stack area, score and end turn controls.</w:t>
             </w:r>
           </w:p>
         </w:tc>
@@ -7217,7 +7256,27 @@
                 <w:szCs w:val="28"/>
                 <w:lang w:val="en-US"/>
               </w:rPr>
-              <w:t xml:space="preserve"> can describe the main screen </w:t>
+              <w:t xml:space="preserve"> can describe the main screen areas and </w:t>
+            </w:r>
+            <w:proofErr w:type="gramStart"/>
+            <w:r>
+              <w:rPr>
+                <w:rFonts w:ascii="Calibri" w:eastAsia="Calibri" w:hAnsi="Calibri" w:cs="Calibri"/>
+                <w:sz w:val="28"/>
+                <w:szCs w:val="28"/>
+                <w:lang w:val="en-US"/>
+              </w:rPr>
+              <w:t>understands</w:t>
+            </w:r>
+            <w:proofErr w:type="gramEnd"/>
+            <w:r>
+              <w:rPr>
+                <w:rFonts w:ascii="Calibri" w:eastAsia="Calibri" w:hAnsi="Calibri" w:cs="Calibri"/>
+                <w:sz w:val="28"/>
+                <w:szCs w:val="28"/>
+                <w:lang w:val="en-US"/>
+              </w:rPr>
+              <w:t xml:space="preserve"> </w:t>
             </w:r>
             <w:r>
               <w:rPr>
@@ -7227,27 +7286,7 @@
                 <w:lang w:val="en-US"/>
               </w:rPr>
               <w:lastRenderedPageBreak/>
-              <w:t xml:space="preserve">areas and </w:t>
-            </w:r>
-            <w:proofErr w:type="gramStart"/>
-            <w:r>
-              <w:rPr>
-                <w:rFonts w:ascii="Calibri" w:eastAsia="Calibri" w:hAnsi="Calibri" w:cs="Calibri"/>
-                <w:sz w:val="28"/>
-                <w:szCs w:val="28"/>
-                <w:lang w:val="en-US"/>
-              </w:rPr>
-              <w:t>understands</w:t>
-            </w:r>
-            <w:proofErr w:type="gramEnd"/>
-            <w:r>
-              <w:rPr>
-                <w:rFonts w:ascii="Calibri" w:eastAsia="Calibri" w:hAnsi="Calibri" w:cs="Calibri"/>
-                <w:sz w:val="28"/>
-                <w:szCs w:val="28"/>
-                <w:lang w:val="en-US"/>
-              </w:rPr>
-              <w:t xml:space="preserve"> what action to take next.</w:t>
+              <w:t>what action to take next.</w:t>
             </w:r>
           </w:p>
         </w:tc>
@@ -10976,7 +11015,6 @@
                 <w:szCs w:val="28"/>
                 <w:lang w:val="en-US"/>
               </w:rPr>
-              <w:lastRenderedPageBreak/>
               <w:t>What was the most frustrating issue?</w:t>
             </w:r>
           </w:p>
@@ -11105,6 +11143,7 @@
                 <w:szCs w:val="28"/>
                 <w:lang w:val="en-US"/>
               </w:rPr>
+              <w:lastRenderedPageBreak/>
               <w:t>Would you play again? Why / why not?</w:t>
             </w:r>
           </w:p>

</xml_diff>